<commit_message>
feat: Sprint 3: Screenshots & Visual Proof
</commit_message>
<xml_diff>
--- a/Coda_Web Documentation.docx
+++ b/Coda_Web Documentation.docx
@@ -5,7 +5,11 @@
     <w:sdt>
       <w:sdtPr>
         <w:rPr>
-          <w:rFonts w:ascii="Times New Roman" w:hAnsi="Times New Roman" w:cs="Times New Roman"/>
+          <w:rFonts w:ascii="Times New Roman" w:eastAsiaTheme="minorEastAsia" w:hAnsi="Times New Roman" w:cs="Times New Roman"/>
+          <w:color w:val="auto"/>
+          <w:sz w:val="22"/>
+          <w:szCs w:val="20"/>
+          <w:lang w:eastAsia="zh-CN"/>
         </w:rPr>
         <w:id w:val="-517156763"/>
         <w:docPartObj>
@@ -15,14 +19,9 @@
       </w:sdtPr>
       <w:sdtEndPr>
         <w:rPr>
-          <w:rFonts w:eastAsiaTheme="minorEastAsia"/>
           <w:b/>
           <w:bCs/>
           <w:noProof/>
-          <w:color w:val="auto"/>
-          <w:sz w:val="22"/>
-          <w:szCs w:val="20"/>
-          <w:lang w:eastAsia="zh-CN"/>
         </w:rPr>
       </w:sdtEndPr>
       <w:sdtContent>
@@ -9627,6 +9626,19 @@
     </w:p>
     <w:p>
       <w:pPr>
+        <w:rPr>
+          <w:rFonts w:cs="Times New Roman"/>
+        </w:rPr>
+      </w:pPr>
+      <w:r>
+        <w:rPr>
+          <w:rFonts w:cs="Times New Roman"/>
+        </w:rPr>
+        <w:t>Perform this sprint and commit the changes while performing the changes with the right commit messages</w:t>
+      </w:r>
+    </w:p>
+    <w:p>
+      <w:pPr>
         <w:pStyle w:val="Heading2"/>
         <w:rPr>
           <w:rFonts w:cs="Times New Roman"/>
@@ -9819,7 +9831,20 @@
         <w:rPr>
           <w:rFonts w:cs="Times New Roman"/>
         </w:rPr>
-        <w:t xml:space="preserve">Landing Page (marketing sections) </w:t>
+        <w:t>Landing Page (marketing sections)</w:t>
+      </w:r>
+    </w:p>
+    <w:p>
+      <w:pPr>
+        <w:rPr>
+          <w:rFonts w:cs="Times New Roman"/>
+        </w:rPr>
+      </w:pPr>
+      <w:r>
+        <w:rPr>
+          <w:rFonts w:cs="Times New Roman"/>
+        </w:rPr>
+        <w:t>Perform this sprint and commit the changes while performing the changes with the right commit messages</w:t>
       </w:r>
     </w:p>
     <w:p>
@@ -9834,6 +9859,7 @@
         <w:rPr>
           <w:rFonts w:cs="Times New Roman"/>
         </w:rPr>
+        <w:lastRenderedPageBreak/>
         <w:t>Sprint 3: Screenshots &amp; Visual Proof</w:t>
       </w:r>
       <w:bookmarkEnd w:id="54"/>
@@ -9901,7 +9927,6 @@
           <w:b/>
           <w:bCs/>
         </w:rPr>
-        <w:lastRenderedPageBreak/>
         <w:t>Tasks:</w:t>
       </w:r>
     </w:p>
@@ -10017,7 +10042,20 @@
         <w:rPr>
           <w:rFonts w:cs="Times New Roman"/>
         </w:rPr>
-        <w:t xml:space="preserve">Landing Page (visual section) </w:t>
+        <w:t>Landing Page (visual section)</w:t>
+      </w:r>
+    </w:p>
+    <w:p>
+      <w:pPr>
+        <w:rPr>
+          <w:rFonts w:cs="Times New Roman"/>
+        </w:rPr>
+      </w:pPr>
+      <w:r>
+        <w:rPr>
+          <w:rFonts w:cs="Times New Roman"/>
+        </w:rPr>
+        <w:t>Perform this sprint and commit the changes while performing the changes with the right commit messages</w:t>
       </w:r>
     </w:p>
     <w:p>
@@ -10219,6 +10257,19 @@
     </w:p>
     <w:p>
       <w:pPr>
+        <w:rPr>
+          <w:rFonts w:cs="Times New Roman"/>
+        </w:rPr>
+      </w:pPr>
+      <w:r>
+        <w:rPr>
+          <w:rFonts w:cs="Times New Roman"/>
+        </w:rPr>
+        <w:t>Perform this sprint and commit the changes while performing the changes with the right commit messages</w:t>
+      </w:r>
+    </w:p>
+    <w:p>
+      <w:pPr>
         <w:pStyle w:val="Heading2"/>
         <w:rPr>
           <w:rFonts w:cs="Times New Roman"/>
@@ -10376,6 +10427,7 @@
         <w:rPr>
           <w:rFonts w:cs="Times New Roman"/>
         </w:rPr>
+        <w:lastRenderedPageBreak/>
         <w:t xml:space="preserve">Functional download flow </w:t>
       </w:r>
     </w:p>
@@ -10425,7 +10477,20 @@
         <w:rPr>
           <w:rFonts w:cs="Times New Roman"/>
         </w:rPr>
-        <w:t xml:space="preserve">Landing Page (download section) </w:t>
+        <w:t>Landing Page (download section)</w:t>
+      </w:r>
+    </w:p>
+    <w:p>
+      <w:pPr>
+        <w:rPr>
+          <w:rFonts w:cs="Times New Roman"/>
+        </w:rPr>
+      </w:pPr>
+      <w:r>
+        <w:rPr>
+          <w:rFonts w:cs="Times New Roman"/>
+        </w:rPr>
+        <w:t>Perform this sprint and commit the changes while performing the changes with the right commit messages</w:t>
       </w:r>
     </w:p>
     <w:p>
@@ -10492,7 +10557,6 @@
         <w:rPr>
           <w:rFonts w:cs="Times New Roman"/>
         </w:rPr>
-        <w:lastRenderedPageBreak/>
         <w:t>Ensure site works without API</w:t>
       </w:r>
     </w:p>
@@ -10624,6 +10688,19 @@
           <w:rFonts w:cs="Times New Roman"/>
         </w:rPr>
         <w:t xml:space="preserve">Landing Page (resilient data layer) </w:t>
+      </w:r>
+    </w:p>
+    <w:p>
+      <w:pPr>
+        <w:rPr>
+          <w:rFonts w:cs="Times New Roman"/>
+        </w:rPr>
+      </w:pPr>
+      <w:r>
+        <w:rPr>
+          <w:rFonts w:cs="Times New Roman"/>
+        </w:rPr>
+        <w:t>Perform this sprint and commit the changes while performing the changes with the right commit messages</w:t>
       </w:r>
     </w:p>
     <w:p>
@@ -10825,6 +10902,19 @@
     </w:p>
     <w:p>
       <w:pPr>
+        <w:rPr>
+          <w:rFonts w:cs="Times New Roman"/>
+        </w:rPr>
+      </w:pPr>
+      <w:r>
+        <w:rPr>
+          <w:rFonts w:cs="Times New Roman"/>
+        </w:rPr>
+        <w:t>Perform this sprint and commit the changes while performing the changes with the right commit messages</w:t>
+      </w:r>
+    </w:p>
+    <w:p>
+      <w:pPr>
         <w:pStyle w:val="Heading2"/>
         <w:rPr>
           <w:rFonts w:cs="Times New Roman"/>
@@ -10869,6 +10959,7 @@
         <w:rPr>
           <w:rFonts w:cs="Times New Roman"/>
         </w:rPr>
+        <w:lastRenderedPageBreak/>
         <w:t>Track user behavior</w:t>
       </w:r>
     </w:p>
@@ -11022,6 +11113,19 @@
     </w:p>
     <w:p>
       <w:pPr>
+        <w:rPr>
+          <w:rFonts w:cs="Times New Roman"/>
+        </w:rPr>
+      </w:pPr>
+      <w:r>
+        <w:rPr>
+          <w:rFonts w:cs="Times New Roman"/>
+        </w:rPr>
+        <w:t>Perform this sprint and commit the changes while performing the changes with the right commit messages</w:t>
+      </w:r>
+    </w:p>
+    <w:p>
+      <w:pPr>
         <w:pStyle w:val="Heading2"/>
         <w:rPr>
           <w:rFonts w:cs="Times New Roman"/>
@@ -11066,7 +11170,6 @@
         <w:rPr>
           <w:rFonts w:cs="Times New Roman"/>
         </w:rPr>
-        <w:lastRenderedPageBreak/>
         <w:t>Handle failures clearly</w:t>
       </w:r>
     </w:p>
@@ -11220,6 +11323,19 @@
     </w:p>
     <w:p>
       <w:pPr>
+        <w:rPr>
+          <w:rFonts w:cs="Times New Roman"/>
+        </w:rPr>
+      </w:pPr>
+      <w:r>
+        <w:rPr>
+          <w:rFonts w:cs="Times New Roman"/>
+        </w:rPr>
+        <w:t>Perform this sprint and commit the changes while performing the changes with the right commit messages</w:t>
+      </w:r>
+    </w:p>
+    <w:p>
+      <w:pPr>
         <w:pStyle w:val="Heading2"/>
         <w:rPr>
           <w:rFonts w:cs="Times New Roman"/>
@@ -11409,6 +11525,7 @@
           <w:b/>
           <w:bCs/>
         </w:rPr>
+        <w:lastRenderedPageBreak/>
         <w:t>Pages Implemented:</w:t>
       </w:r>
     </w:p>
@@ -11435,6 +11552,12 @@
           <w:rFonts w:cs="Times New Roman"/>
         </w:rPr>
       </w:pPr>
+      <w:r>
+        <w:rPr>
+          <w:rFonts w:cs="Times New Roman"/>
+        </w:rPr>
+        <w:t>Perform this sprint and commit the changes while performing the changes with the right commit messages</w:t>
+      </w:r>
     </w:p>
     <w:sectPr>
       <w:footerReference w:type="default" r:id="rId8"/>
@@ -25292,7 +25415,6 @@
   <w:style w:type="character" w:default="1" w:styleId="DefaultParagraphFont">
     <w:name w:val="Default Paragraph Font"/>
     <w:uiPriority w:val="1"/>
-    <w:semiHidden/>
     <w:unhideWhenUsed/>
   </w:style>
   <w:style w:type="table" w:default="1" w:styleId="TableNormal">

</xml_diff>